<commit_message>
Trustee photos on the About page and in both trustee profiles (not yet published)
Co-Authored-By: Claude Opus 5.5 <noreply@anthropic.com>
Claude-Session: https://claude.ai/code/session_01RSCU9Tog2TmXVif83jTYoy
</commit_message>
<xml_diff>
--- a/content/Trustee-Profile-Aayushi-Hariharan.docx
+++ b/content/Trustee-Profile-Aayushi-Hariharan.docx
@@ -52,7 +52,7 @@
                 <wp:inline distT="0" distB="0" distL="0" distR="0">
                   <wp:extent cx="1714500" cy="676275"/>
                   <wp:effectExtent t="0" r="0" b="0" l="0"/>
-                  <wp:docPr id="4" name=""/>
+                  <wp:docPr id="6" name=""/>
                   <wp:cNvGraphicFramePr>
                     <a:graphicFrameLocks xmlns:a="http://schemas.openxmlformats.org/drawingml/2006/main" noChangeAspect="1"/>
                   </wp:cNvGraphicFramePr>
@@ -143,23 +143,9 @@
         </w:tc>
       </w:tr>
     </w:tbl>
-    <w:p>
-      <w:pPr>
-        <w:spacing w:after="20" w:before="0"/>
-      </w:pPr>
-      <w:r>
-        <w:rPr>
-          <w:rFonts w:ascii="Palatino Linotype" w:cs="Palatino Linotype" w:eastAsia="Palatino Linotype" w:hAnsi="Palatino Linotype"/>
-          <w:color w:val="13162C"/>
-          <w:sz w:val="52"/>
-          <w:szCs w:val="52"/>
-        </w:rPr>
-        <w:t xml:space="preserve">Aayushi Hariharan</w:t>
-      </w:r>
-    </w:p>
     <w:tbl>
       <w:tblPr>
-        <w:tblW w:type="dxa" w:w="3000"/>
+        <w:tblW w:type="dxa" w:w="9638"/>
         <w:tblBorders>
           <w:top w:val="none" w:color="FFFFFF" w:sz="0"/>
           <w:left w:val="none" w:color="FFFFFF" w:sz="0"/>
@@ -171,42 +157,260 @@
         <w:tblLayout w:type="fixed"/>
       </w:tblPr>
       <w:tblGrid>
-        <w:gridCol w:w="3000"/>
+        <w:gridCol w:w="6738"/>
+        <w:gridCol w:w="300"/>
+        <w:gridCol w:w="2600"/>
       </w:tblGrid>
       <w:tr>
         <w:tc>
           <w:tcPr>
-            <w:tcW w:type="dxa" w:w="3000"/>
+            <w:tcW w:type="dxa" w:w="6738"/>
             <w:tcBorders>
               <w:top w:val="none" w:color="FFFFFF" w:sz="0"/>
               <w:left w:val="none" w:color="FFFFFF" w:sz="0"/>
               <w:bottom w:val="none" w:color="FFFFFF" w:sz="0"/>
               <w:right w:val="none" w:color="FFFFFF" w:sz="0"/>
             </w:tcBorders>
-            <w:shd w:fill="2F7FA0" w:color="auto" w:val="clear"/>
             <w:tcMar>
-              <w:top w:type="dxa" w:w="70"/>
-              <w:left w:type="dxa" w:w="180"/>
-              <w:bottom w:type="dxa" w:w="70"/>
-              <w:right w:type="dxa" w:w="180"/>
+              <w:top w:type="dxa" w:w="0"/>
+              <w:left w:type="dxa" w:w="0"/>
+              <w:bottom w:type="dxa" w:w="0"/>
+              <w:right w:type="dxa" w:w="0"/>
             </w:tcMar>
             <w:vAlign w:val="top"/>
           </w:tcPr>
           <w:p>
             <w:pPr>
-              <w:spacing w:after="0" w:before="0" w:line="240"/>
-            </w:pPr>
-            <w:r>
-              <w:rPr>
-                <w:rFonts w:ascii="Palatino Linotype" w:cs="Palatino Linotype" w:eastAsia="Palatino Linotype" w:hAnsi="Palatino Linotype"/>
-                <w:b/>
-                <w:bCs/>
-                <w:color w:val="FFFFFF"/>
-                <w:spacing w:val="40"/>
-                <w:sz w:val="16"/>
-                <w:szCs w:val="16"/>
-              </w:rPr>
-              <w:t xml:space="preserve">TRUSTEE</w:t>
+              <w:spacing w:after="20" w:before="0"/>
+            </w:pPr>
+            <w:r>
+              <w:rPr>
+                <w:rFonts w:ascii="Palatino Linotype" w:cs="Palatino Linotype" w:eastAsia="Palatino Linotype" w:hAnsi="Palatino Linotype"/>
+                <w:color w:val="13162C"/>
+                <w:sz w:val="52"/>
+                <w:szCs w:val="52"/>
+              </w:rPr>
+              <w:t xml:space="preserve">Aayushi Hariharan</w:t>
+            </w:r>
+          </w:p>
+          <w:tbl>
+            <w:tblPr>
+              <w:tblW w:type="dxa" w:w="3000"/>
+              <w:tblBorders>
+                <w:top w:val="none" w:color="FFFFFF" w:sz="0"/>
+                <w:left w:val="none" w:color="FFFFFF" w:sz="0"/>
+                <w:bottom w:val="none" w:color="FFFFFF" w:sz="0"/>
+                <w:right w:val="none" w:color="FFFFFF" w:sz="0"/>
+                <w:insideH w:val="none" w:color="FFFFFF" w:sz="0"/>
+                <w:insideV w:val="none" w:color="FFFFFF" w:sz="0"/>
+              </w:tblBorders>
+              <w:tblLayout w:type="fixed"/>
+            </w:tblPr>
+            <w:tblGrid>
+              <w:gridCol w:w="3000"/>
+            </w:tblGrid>
+            <w:tr>
+              <w:tc>
+                <w:tcPr>
+                  <w:tcW w:type="dxa" w:w="3000"/>
+                  <w:tcBorders>
+                    <w:top w:val="none" w:color="FFFFFF" w:sz="0"/>
+                    <w:left w:val="none" w:color="FFFFFF" w:sz="0"/>
+                    <w:bottom w:val="none" w:color="FFFFFF" w:sz="0"/>
+                    <w:right w:val="none" w:color="FFFFFF" w:sz="0"/>
+                  </w:tcBorders>
+                  <w:shd w:fill="2F7FA0" w:color="auto" w:val="clear"/>
+                  <w:tcMar>
+                    <w:top w:type="dxa" w:w="70"/>
+                    <w:left w:type="dxa" w:w="180"/>
+                    <w:bottom w:type="dxa" w:w="70"/>
+                    <w:right w:type="dxa" w:w="180"/>
+                  </w:tcMar>
+                  <w:vAlign w:val="top"/>
+                </w:tcPr>
+                <w:p>
+                  <w:pPr>
+                    <w:spacing w:after="0" w:before="0" w:line="240"/>
+                  </w:pPr>
+                  <w:r>
+                    <w:rPr>
+                      <w:rFonts w:ascii="Palatino Linotype" w:cs="Palatino Linotype" w:eastAsia="Palatino Linotype" w:hAnsi="Palatino Linotype"/>
+                      <w:b/>
+                      <w:bCs/>
+                      <w:color w:val="FFFFFF"/>
+                      <w:spacing w:val="40"/>
+                      <w:sz w:val="16"/>
+                      <w:szCs w:val="16"/>
+                    </w:rPr>
+                    <w:t xml:space="preserve">TRUSTEE</w:t>
+                  </w:r>
+                </w:p>
+              </w:tc>
+            </w:tr>
+          </w:tbl>
+          <w:p>
+            <w:pPr>
+              <w:spacing w:after="160" w:before="0" w:line="290"/>
+            </w:pPr>
+          </w:p>
+          <w:p>
+            <w:pPr>
+              <w:spacing w:after="0" w:before="0" w:line="320"/>
+            </w:pPr>
+            <w:r>
+              <w:rPr>
+                <w:rFonts w:ascii="Palatino Linotype" w:cs="Palatino Linotype" w:eastAsia="Palatino Linotype" w:hAnsi="Palatino Linotype"/>
+                <w:color w:val="13162C"/>
+                <w:sz w:val="23"/>
+                <w:szCs w:val="23"/>
+              </w:rPr>
+              <w:t xml:space="preserve">Aayushi serves on the foundation’s board of trustees and helps </w:t>
+            </w:r>
+            <w:r>
+              <w:rPr>
+                <w:rFonts w:ascii="Palatino Linotype" w:cs="Palatino Linotype" w:eastAsia="Palatino Linotype" w:hAnsi="Palatino Linotype"/>
+                <w:b/>
+                <w:bCs/>
+                <w:color w:val="2F7FA0"/>
+                <w:sz w:val="23"/>
+                <w:szCs w:val="23"/>
+              </w:rPr>
+              <w:t xml:space="preserve">shape its creative direction</w:t>
+            </w:r>
+            <w:r>
+              <w:rPr>
+                <w:rFonts w:ascii="Palatino Linotype" w:cs="Palatino Linotype" w:eastAsia="Palatino Linotype" w:hAnsi="Palatino Linotype"/>
+                <w:color w:val="13162C"/>
+                <w:sz w:val="23"/>
+                <w:szCs w:val="23"/>
+              </w:rPr>
+              <w:t xml:space="preserve">. A strategic designer trained at </w:t>
+            </w:r>
+            <w:r>
+              <w:rPr>
+                <w:rFonts w:ascii="Palatino Linotype" w:cs="Palatino Linotype" w:eastAsia="Palatino Linotype" w:hAnsi="Palatino Linotype"/>
+                <w:b/>
+                <w:bCs/>
+                <w:color w:val="2F7FA0"/>
+                <w:sz w:val="23"/>
+                <w:szCs w:val="23"/>
+              </w:rPr>
+              <w:t xml:space="preserve">Central Saint Martins</w:t>
+            </w:r>
+            <w:r>
+              <w:rPr>
+                <w:rFonts w:ascii="Palatino Linotype" w:cs="Palatino Linotype" w:eastAsia="Palatino Linotype" w:hAnsi="Palatino Linotype"/>
+                <w:color w:val="13162C"/>
+                <w:sz w:val="23"/>
+                <w:szCs w:val="23"/>
+              </w:rPr>
+              <w:t xml:space="preserve">, she has created work at every scale, </w:t>
+            </w:r>
+            <w:r>
+              <w:rPr>
+                <w:rFonts w:ascii="Palatino Linotype" w:cs="Palatino Linotype" w:eastAsia="Palatino Linotype" w:hAnsi="Palatino Linotype"/>
+                <w:b/>
+                <w:bCs/>
+                <w:color w:val="2F7FA0"/>
+                <w:sz w:val="23"/>
+                <w:szCs w:val="23"/>
+              </w:rPr>
+              <w:t xml:space="preserve">from large installations and print campaigns to websites and mobile apps</w:t>
+            </w:r>
+            <w:r>
+              <w:rPr>
+                <w:rFonts w:ascii="Palatino Linotype" w:cs="Palatino Linotype" w:eastAsia="Palatino Linotype" w:hAnsi="Palatino Linotype"/>
+                <w:color w:val="13162C"/>
+                <w:sz w:val="23"/>
+                <w:szCs w:val="23"/>
+              </w:rPr>
+              <w:t xml:space="preserve">, always centred on people and the stories that move them to act.</w:t>
+            </w:r>
+          </w:p>
+        </w:tc>
+        <w:tc>
+          <w:tcPr>
+            <w:tcW w:type="dxa" w:w="300"/>
+            <w:tcBorders>
+              <w:top w:val="none" w:color="FFFFFF" w:sz="0"/>
+              <w:left w:val="none" w:color="FFFFFF" w:sz="0"/>
+              <w:bottom w:val="none" w:color="FFFFFF" w:sz="0"/>
+              <w:right w:val="none" w:color="FFFFFF" w:sz="0"/>
+            </w:tcBorders>
+            <w:tcMar>
+              <w:top w:type="dxa" w:w="0"/>
+              <w:left w:type="dxa" w:w="0"/>
+              <w:bottom w:type="dxa" w:w="0"/>
+              <w:right w:type="dxa" w:w="0"/>
+            </w:tcMar>
+            <w:vAlign w:val="top"/>
+          </w:tcPr>
+          <w:p>
+            <w:pPr>
+              <w:spacing w:after="0" w:before="0" w:line="290"/>
+            </w:pPr>
+          </w:p>
+        </w:tc>
+        <w:tc>
+          <w:tcPr>
+            <w:tcW w:type="dxa" w:w="2600"/>
+            <w:tcBorders>
+              <w:top w:val="single" w:color="2F7FA0" w:sz="24"/>
+              <w:left w:val="none" w:color="FFFFFF" w:sz="0"/>
+              <w:bottom w:val="none" w:color="FFFFFF" w:sz="0"/>
+              <w:right w:val="none" w:color="FFFFFF" w:sz="0"/>
+            </w:tcBorders>
+            <w:tcMar>
+              <w:top w:type="dxa" w:w="0"/>
+              <w:left w:type="dxa" w:w="0"/>
+              <w:bottom w:type="dxa" w:w="0"/>
+              <w:right w:type="dxa" w:w="0"/>
+            </w:tcMar>
+            <w:vAlign w:val="top"/>
+          </w:tcPr>
+          <w:p>
+            <w:pPr>
+              <w:spacing w:after="0" w:before="0"/>
+            </w:pPr>
+            <w:r>
+              <w:drawing>
+                <wp:inline distT="0" distB="0" distL="0" distR="0">
+                  <wp:extent cx="1238250" cy="1552575"/>
+                  <wp:effectExtent t="0" r="0" b="0" l="0"/>
+                  <wp:docPr id="4" name=""/>
+                  <wp:cNvGraphicFramePr>
+                    <a:graphicFrameLocks xmlns:a="http://schemas.openxmlformats.org/drawingml/2006/main" noChangeAspect="1"/>
+                  </wp:cNvGraphicFramePr>
+                  <a:graphic xmlns:a="http://schemas.openxmlformats.org/drawingml/2006/main">
+                    <a:graphicData uri="http://schemas.openxmlformats.org/drawingml/2006/picture">
+                      <pic:pic xmlns:pic="http://schemas.openxmlformats.org/drawingml/2006/picture">
+                        <pic:nvPicPr>
+                          <pic:cNvPr id="0" name="" descr=""/>
+                          <pic:cNvPicPr>
+                            <a:picLocks noChangeAspect="1" noChangeArrowheads="1"/>
+                          </pic:cNvPicPr>
+                        </pic:nvPicPr>
+                        <pic:blipFill>
+                          <a:blip r:embed="rId8" cstate="none"/>
+                          <a:srcRect/>
+                          <a:stretch>
+                            <a:fillRect/>
+                          </a:stretch>
+                        </pic:blipFill>
+                        <pic:spPr bwMode="auto">
+                          <a:xfrm>
+                            <a:off x="0" y="0"/>
+                            <a:ext cx="1238250" cy="1552575"/>
+                          </a:xfrm>
+                          <a:prstGeom prst="rect">
+                            <a:avLst/>
+                          </a:prstGeom>
+                        </pic:spPr>
+                      </pic:pic>
+                    </a:graphicData>
+                  </a:graphic>
+                </wp:inline>
+              </w:drawing>
             </w:r>
           </w:p>
         </w:tc>
@@ -214,82 +418,8 @@
     </w:tbl>
     <w:p>
       <w:pPr>
-        <w:spacing w:after="160" w:before="0" w:line="290"/>
+        <w:spacing w:after="200" w:before="0" w:line="290"/>
       </w:pPr>
-    </w:p>
-    <w:p>
-      <w:pPr>
-        <w:spacing w:after="220" w:before="0" w:line="320"/>
-      </w:pPr>
-      <w:r>
-        <w:rPr>
-          <w:rFonts w:ascii="Palatino Linotype" w:cs="Palatino Linotype" w:eastAsia="Palatino Linotype" w:hAnsi="Palatino Linotype"/>
-          <w:color w:val="13162C"/>
-          <w:sz w:val="23"/>
-          <w:szCs w:val="23"/>
-        </w:rPr>
-        <w:t xml:space="preserve">Aayushi serves on the foundation’s board of trustees and helps </w:t>
-      </w:r>
-      <w:r>
-        <w:rPr>
-          <w:rFonts w:ascii="Palatino Linotype" w:cs="Palatino Linotype" w:eastAsia="Palatino Linotype" w:hAnsi="Palatino Linotype"/>
-          <w:b/>
-          <w:bCs/>
-          <w:color w:val="2F7FA0"/>
-          <w:sz w:val="23"/>
-          <w:szCs w:val="23"/>
-        </w:rPr>
-        <w:t xml:space="preserve">shape its creative direction</w:t>
-      </w:r>
-      <w:r>
-        <w:rPr>
-          <w:rFonts w:ascii="Palatino Linotype" w:cs="Palatino Linotype" w:eastAsia="Palatino Linotype" w:hAnsi="Palatino Linotype"/>
-          <w:color w:val="13162C"/>
-          <w:sz w:val="23"/>
-          <w:szCs w:val="23"/>
-        </w:rPr>
-        <w:t xml:space="preserve">. A strategic designer trained at </w:t>
-      </w:r>
-      <w:r>
-        <w:rPr>
-          <w:rFonts w:ascii="Palatino Linotype" w:cs="Palatino Linotype" w:eastAsia="Palatino Linotype" w:hAnsi="Palatino Linotype"/>
-          <w:b/>
-          <w:bCs/>
-          <w:color w:val="2F7FA0"/>
-          <w:sz w:val="23"/>
-          <w:szCs w:val="23"/>
-        </w:rPr>
-        <w:t xml:space="preserve">Central Saint Martins</w:t>
-      </w:r>
-      <w:r>
-        <w:rPr>
-          <w:rFonts w:ascii="Palatino Linotype" w:cs="Palatino Linotype" w:eastAsia="Palatino Linotype" w:hAnsi="Palatino Linotype"/>
-          <w:color w:val="13162C"/>
-          <w:sz w:val="23"/>
-          <w:szCs w:val="23"/>
-        </w:rPr>
-        <w:t xml:space="preserve">, she has created work at every scale, </w:t>
-      </w:r>
-      <w:r>
-        <w:rPr>
-          <w:rFonts w:ascii="Palatino Linotype" w:cs="Palatino Linotype" w:eastAsia="Palatino Linotype" w:hAnsi="Palatino Linotype"/>
-          <w:b/>
-          <w:bCs/>
-          <w:color w:val="2F7FA0"/>
-          <w:sz w:val="23"/>
-          <w:szCs w:val="23"/>
-        </w:rPr>
-        <w:t xml:space="preserve">from large installations and print campaigns to websites and mobile apps</w:t>
-      </w:r>
-      <w:r>
-        <w:rPr>
-          <w:rFonts w:ascii="Palatino Linotype" w:cs="Palatino Linotype" w:eastAsia="Palatino Linotype" w:hAnsi="Palatino Linotype"/>
-          <w:color w:val="13162C"/>
-          <w:sz w:val="23"/>
-          <w:szCs w:val="23"/>
-        </w:rPr>
-        <w:t xml:space="preserve">, always centred on people and the stories that move them to act.</w:t>
-      </w:r>
     </w:p>
     <w:p>
       <w:pPr>
@@ -300,7 +430,7 @@
           <wp:inline distT="0" distB="0" distL="0" distR="0">
             <wp:extent cx="6115050" cy="1809750"/>
             <wp:effectExtent t="0" r="0" b="0" l="0"/>
-            <wp:docPr id="3" name=""/>
+            <wp:docPr id="5" name=""/>
             <wp:cNvGraphicFramePr>
               <a:graphicFrameLocks xmlns:a="http://schemas.openxmlformats.org/drawingml/2006/main" noChangeAspect="1"/>
             </wp:cNvGraphicFramePr>
@@ -314,7 +444,7 @@
                     </pic:cNvPicPr>
                   </pic:nvPicPr>
                   <pic:blipFill>
-                    <a:blip r:embed="rId8" cstate="none"/>
+                    <a:blip r:embed="rId9" cstate="none"/>
                     <a:srcRect/>
                     <a:stretch>
                       <a:fillRect/>

</xml_diff>

<commit_message>
Trustee profiles: larger, face-centred portraits without the top line; Aayushi's banner trimmed to two pieces
Co-Authored-By: Claude Opus 5.5 <noreply@anthropic.com>
Claude-Session: https://claude.ai/code/session_01RSCU9Tog2TmXVif83jTYoy
</commit_message>
<xml_diff>
--- a/content/Trustee-Profile-Aayushi-Hariharan.docx
+++ b/content/Trustee-Profile-Aayushi-Hariharan.docx
@@ -157,14 +157,14 @@
         <w:tblLayout w:type="fixed"/>
       </w:tblPr>
       <w:tblGrid>
-        <w:gridCol w:w="6738"/>
+        <w:gridCol w:w="6338"/>
         <w:gridCol w:w="300"/>
-        <w:gridCol w:w="2600"/>
+        <w:gridCol w:w="3000"/>
       </w:tblGrid>
       <w:tr>
         <w:tc>
           <w:tcPr>
-            <w:tcW w:type="dxa" w:w="6738"/>
+            <w:tcW w:type="dxa" w:w="6338"/>
             <w:tcBorders>
               <w:top w:val="none" w:color="FFFFFF" w:sz="0"/>
               <w:left w:val="none" w:color="FFFFFF" w:sz="0"/>
@@ -353,9 +353,9 @@
         </w:tc>
         <w:tc>
           <w:tcPr>
-            <w:tcW w:type="dxa" w:w="2600"/>
+            <w:tcW w:type="dxa" w:w="3000"/>
             <w:tcBorders>
-              <w:top w:val="single" w:color="2F7FA0" w:sz="24"/>
+              <w:top w:val="none" w:color="FFFFFF" w:sz="0"/>
               <w:left w:val="none" w:color="FFFFFF" w:sz="0"/>
               <w:bottom w:val="none" w:color="FFFFFF" w:sz="0"/>
               <w:right w:val="none" w:color="FFFFFF" w:sz="0"/>
@@ -371,11 +371,12 @@
           <w:p>
             <w:pPr>
               <w:spacing w:after="0" w:before="0"/>
+              <w:jc w:val="right"/>
             </w:pPr>
             <w:r>
               <w:drawing>
                 <wp:inline distT="0" distB="0" distL="0" distR="0">
-                  <wp:extent cx="1238250" cy="1552575"/>
+                  <wp:extent cx="1428750" cy="1905000"/>
                   <wp:effectExtent t="0" r="0" b="0" l="0"/>
                   <wp:docPr id="4" name=""/>
                   <wp:cNvGraphicFramePr>
@@ -400,7 +401,7 @@
                         <pic:spPr bwMode="auto">
                           <a:xfrm>
                             <a:off x="0" y="0"/>
-                            <a:ext cx="1238250" cy="1552575"/>
+                            <a:ext cx="1428750" cy="1905000"/>
                           </a:xfrm>
                           <a:prstGeom prst="rect">
                             <a:avLst/>
@@ -479,7 +480,7 @@
           <w:sz w:val="15"/>
           <w:szCs w:val="15"/>
         </w:rPr>
-        <w:t xml:space="preserve">Aayushi’s work, from left: infographic panels on the 17 SDGs for Govardhan Ecovillage, a community mural, the Manthan Shivir book and the Simple Vedas app.</w:t>
+        <w:t xml:space="preserve">Aayushi’s work: infographic panels on the 17 SDGs for Govardhan Ecovillage, and the Manthan Shivir book.</w:t>
       </w:r>
     </w:p>
     <w:tbl>

</xml_diff>

<commit_message>
Harneet's trustee profile: Recognition panel with the UPBTVP certificate for Priya Kund
Co-Authored-By: Claude Opus 5.5 <noreply@anthropic.com>
Claude-Session: https://claude.ai/code/session_01RSCU9Tog2TmXVif83jTYoy
</commit_message>
<xml_diff>
--- a/content/Trustee-Profile-Aayushi-Hariharan.docx
+++ b/content/Trustee-Profile-Aayushi-Hariharan.docx
@@ -52,7 +52,7 @@
                 <wp:inline distT="0" distB="0" distL="0" distR="0">
                   <wp:extent cx="1714500" cy="676275"/>
                   <wp:effectExtent t="0" r="0" b="0" l="0"/>
-                  <wp:docPr id="6" name=""/>
+                  <wp:docPr id="7" name=""/>
                   <wp:cNvGraphicFramePr>
                     <a:graphicFrameLocks xmlns:a="http://schemas.openxmlformats.org/drawingml/2006/main" noChangeAspect="1"/>
                   </wp:cNvGraphicFramePr>
@@ -378,7 +378,7 @@
                 <wp:inline distT="0" distB="0" distL="0" distR="0">
                   <wp:extent cx="1428750" cy="1905000"/>
                   <wp:effectExtent t="0" r="0" b="0" l="0"/>
-                  <wp:docPr id="4" name=""/>
+                  <wp:docPr id="5" name=""/>
                   <wp:cNvGraphicFramePr>
                     <a:graphicFrameLocks xmlns:a="http://schemas.openxmlformats.org/drawingml/2006/main" noChangeAspect="1"/>
                   </wp:cNvGraphicFramePr>
@@ -431,7 +431,7 @@
           <wp:inline distT="0" distB="0" distL="0" distR="0">
             <wp:extent cx="6115050" cy="1809750"/>
             <wp:effectExtent t="0" r="0" b="0" l="0"/>
-            <wp:docPr id="5" name=""/>
+            <wp:docPr id="6" name=""/>
             <wp:cNvGraphicFramePr>
               <a:graphicFrameLocks xmlns:a="http://schemas.openxmlformats.org/drawingml/2006/main" noChangeAspect="1"/>
             </wp:cNvGraphicFramePr>

</xml_diff>

<commit_message>
Harneet's trustee profile: two-photo banner (site visit and the Priya Kund certificate), matching Aayushi's
Co-Authored-By: Claude Opus 5.5 <noreply@anthropic.com>
Claude-Session: https://claude.ai/code/session_01RSCU9Tog2TmXVif83jTYoy
</commit_message>
<xml_diff>
--- a/content/Trustee-Profile-Aayushi-Hariharan.docx
+++ b/content/Trustee-Profile-Aayushi-Hariharan.docx
@@ -52,7 +52,7 @@
                 <wp:inline distT="0" distB="0" distL="0" distR="0">
                   <wp:extent cx="1714500" cy="676275"/>
                   <wp:effectExtent t="0" r="0" b="0" l="0"/>
-                  <wp:docPr id="7" name=""/>
+                  <wp:docPr id="6" name=""/>
                   <wp:cNvGraphicFramePr>
                     <a:graphicFrameLocks xmlns:a="http://schemas.openxmlformats.org/drawingml/2006/main" noChangeAspect="1"/>
                   </wp:cNvGraphicFramePr>
@@ -378,7 +378,7 @@
                 <wp:inline distT="0" distB="0" distL="0" distR="0">
                   <wp:extent cx="1428750" cy="1905000"/>
                   <wp:effectExtent t="0" r="0" b="0" l="0"/>
-                  <wp:docPr id="5" name=""/>
+                  <wp:docPr id="4" name=""/>
                   <wp:cNvGraphicFramePr>
                     <a:graphicFrameLocks xmlns:a="http://schemas.openxmlformats.org/drawingml/2006/main" noChangeAspect="1"/>
                   </wp:cNvGraphicFramePr>
@@ -431,7 +431,7 @@
           <wp:inline distT="0" distB="0" distL="0" distR="0">
             <wp:extent cx="6115050" cy="1809750"/>
             <wp:effectExtent t="0" r="0" b="0" l="0"/>
-            <wp:docPr id="6" name=""/>
+            <wp:docPr id="5" name=""/>
             <wp:cNvGraphicFramePr>
               <a:graphicFrameLocks xmlns:a="http://schemas.openxmlformats.org/drawingml/2006/main" noChangeAspect="1"/>
             </wp:cNvGraphicFramePr>

</xml_diff>

<commit_message>
Trustee profiles: closing paragraph as normal text with bold highlights; Harneet's portrait shows less sky and more below
Co-Authored-By: Claude Opus 5.5 <noreply@anthropic.com>
Claude-Session: https://claude.ai/code/session_01RSCU9Tog2TmXVif83jTYoy
</commit_message>
<xml_diff>
--- a/content/Trustee-Profile-Aayushi-Hariharan.docx
+++ b/content/Trustee-Profile-Aayushi-Hariharan.docx
@@ -1488,78 +1488,58 @@
     </w:tbl>
     <w:p>
       <w:pPr>
-        <w:spacing w:after="260" w:before="0" w:line="290"/>
+        <w:spacing w:after="0" w:before="260" w:line="300"/>
       </w:pPr>
+      <w:r>
+        <w:rPr>
+          <w:rFonts w:ascii="Palatino Linotype" w:cs="Palatino Linotype" w:eastAsia="Palatino Linotype" w:hAnsi="Palatino Linotype"/>
+          <w:color w:val="2E3250"/>
+          <w:sz w:val="20"/>
+          <w:szCs w:val="20"/>
+        </w:rPr>
+        <w:t xml:space="preserve">Aayushi’s practice is rooted in </w:t>
+      </w:r>
+      <w:r>
+        <w:rPr>
+          <w:rFonts w:ascii="Palatino Linotype" w:cs="Palatino Linotype" w:eastAsia="Palatino Linotype" w:hAnsi="Palatino Linotype"/>
+          <w:b/>
+          <w:bCs/>
+          <w:color w:val="13162C"/>
+          <w:sz w:val="20"/>
+          <w:szCs w:val="20"/>
+        </w:rPr>
+        <w:t xml:space="preserve">human-centred design</w:t>
+      </w:r>
+      <w:r>
+        <w:rPr>
+          <w:rFonts w:ascii="Palatino Linotype" w:cs="Palatino Linotype" w:eastAsia="Palatino Linotype" w:hAnsi="Palatino Linotype"/>
+          <w:color w:val="2E3250"/>
+          <w:sz w:val="20"/>
+          <w:szCs w:val="20"/>
+        </w:rPr>
+        <w:t xml:space="preserve">: understanding people first, then shaping the experiences, stories and systems that serve them. She brings to S3 </w:t>
+      </w:r>
+      <w:r>
+        <w:rPr>
+          <w:rFonts w:ascii="Palatino Linotype" w:cs="Palatino Linotype" w:eastAsia="Palatino Linotype" w:hAnsi="Palatino Linotype"/>
+          <w:b/>
+          <w:bCs/>
+          <w:color w:val="13162C"/>
+          <w:sz w:val="20"/>
+          <w:szCs w:val="20"/>
+        </w:rPr>
+        <w:t xml:space="preserve">a global eye and a deep respect for the communities it serves</w:t>
+      </w:r>
+      <w:r>
+        <w:rPr>
+          <w:rFonts w:ascii="Palatino Linotype" w:cs="Palatino Linotype" w:eastAsia="Palatino Linotype" w:hAnsi="Palatino Linotype"/>
+          <w:color w:val="2E3250"/>
+          <w:sz w:val="20"/>
+          <w:szCs w:val="20"/>
+        </w:rPr>
+        <w:t xml:space="preserve">, helping the foundation share its work with clarity, dignity and care.</w:t>
+      </w:r>
     </w:p>
-    <w:tbl>
-      <w:tblPr>
-        <w:tblW w:type="dxa" w:w="9638"/>
-        <w:tblBorders>
-          <w:top w:val="none" w:color="FFFFFF" w:sz="0"/>
-          <w:left w:val="none" w:color="FFFFFF" w:sz="0"/>
-          <w:bottom w:val="none" w:color="FFFFFF" w:sz="0"/>
-          <w:right w:val="none" w:color="FFFFFF" w:sz="0"/>
-          <w:insideH w:val="none" w:color="FFFFFF" w:sz="0"/>
-          <w:insideV w:val="none" w:color="FFFFFF" w:sz="0"/>
-        </w:tblBorders>
-        <w:tblLayout w:type="fixed"/>
-      </w:tblPr>
-      <w:tblGrid>
-        <w:gridCol w:w="9638"/>
-      </w:tblGrid>
-      <w:tr>
-        <w:trPr>
-          <w:cantSplit/>
-        </w:trPr>
-        <w:tc>
-          <w:tcPr>
-            <w:tcW w:type="dxa" w:w="9638"/>
-            <w:tcBorders>
-              <w:top w:val="none" w:color="FFFFFF" w:sz="0"/>
-              <w:left w:val="single" w:color="2F7FA0" w:sz="24"/>
-              <w:bottom w:val="none" w:color="FFFFFF" w:sz="0"/>
-              <w:right w:val="none" w:color="FFFFFF" w:sz="0"/>
-            </w:tcBorders>
-            <w:shd w:fill="E7F3F7" w:color="auto" w:val="clear"/>
-            <w:tcMar>
-              <w:top w:type="dxa" w:w="240"/>
-              <w:left w:type="dxa" w:w="360"/>
-              <w:bottom w:type="dxa" w:w="240"/>
-              <w:right w:type="dxa" w:w="360"/>
-            </w:tcMar>
-            <w:vAlign w:val="top"/>
-          </w:tcPr>
-          <w:p>
-            <w:pPr>
-              <w:spacing w:after="0" w:before="0" w:line="300"/>
-            </w:pPr>
-            <w:r>
-              <w:rPr>
-                <w:rFonts w:ascii="Palatino Linotype" w:cs="Palatino Linotype" w:eastAsia="Palatino Linotype" w:hAnsi="Palatino Linotype"/>
-                <w:color w:val="2F7FA0"/>
-                <w:sz w:val="80"/>
-                <w:szCs w:val="80"/>
-              </w:rPr>
-              <w:t xml:space="preserve">“</w:t>
-            </w:r>
-          </w:p>
-          <w:p>
-            <w:pPr>
-              <w:spacing w:after="0" w:before="0" w:line="320"/>
-            </w:pPr>
-            <w:r>
-              <w:rPr>
-                <w:rFonts w:ascii="Palatino Linotype" w:cs="Palatino Linotype" w:eastAsia="Palatino Linotype" w:hAnsi="Palatino Linotype"/>
-                <w:color w:val="13162C"/>
-                <w:sz w:val="22"/>
-                <w:szCs w:val="22"/>
-              </w:rPr>
-              <w:t xml:space="preserve">Aayushi’s practice is rooted in human-centred design: understanding people first, then shaping the experiences, stories and systems that serve them. She brings to S3 a global eye and a deep respect for the communities it serves, helping the foundation share its work with clarity, dignity and care.</w:t>
-            </w:r>
-          </w:p>
-        </w:tc>
-      </w:tr>
-    </w:tbl>
     <w:p>
       <w:pPr>
         <w:spacing w:after="280" w:before="0" w:line="290"/>

</xml_diff>